<commit_message>
Replaced asterisks with crosses in pboe templates
</commit_message>
<xml_diff>
--- a/GenBOE/GenBOE.Web/Templates/Export/PBOE_2.docx
+++ b/GenBOE/GenBOE.Web/Templates/Export/PBOE_2.docx
@@ -2583,6 +2583,7 @@
                 <w:b/>
                 <w:sz w:val="20"/>
               </w:rPr>
+              <w:lastRenderedPageBreak/>
               <w:t>SCHEDULE OF EVENTS</w:t>
             </w:r>
             <w:r>
@@ -2979,6 +2980,28 @@
               </w:rPr>
               <w:t>Cost Analysis</w:t>
             </w:r>
+            <w:r>
+              <w:rPr>
+                <w:sz w:val="20"/>
+              </w:rPr>
+              <w:t xml:space="preserve"> </w:t>
+            </w:r>
+            <w:r>
+              <w:rPr>
+                <w:rFonts w:ascii="Arial Narrow" w:hAnsi="Arial Narrow" w:cstheme="minorHAnsi"/>
+                <w:bCs/>
+                <w:color w:val="000000" w:themeColor="text1"/>
+                <w:sz w:val="21"/>
+                <w:szCs w:val="21"/>
+                <w:shd w:val="clear" w:color="auto" w:fill="FFFFFF"/>
+                <w14:textOutline w14:w="0" w14:cap="flat" w14:cmpd="sng" w14:algn="ctr">
+                  <w14:noFill/>
+                  <w14:prstDash w14:val="solid"/>
+                  <w14:round/>
+                </w14:textOutline>
+              </w:rPr>
+              <w:t>†</w:t>
+            </w:r>
           </w:p>
         </w:tc>
         <w:tc>
@@ -3021,7 +3044,23 @@
               <w:rPr>
                 <w:sz w:val="20"/>
               </w:rPr>
-              <w:t>*</w:t>
+              <w:t xml:space="preserve"> </w:t>
+            </w:r>
+            <w:r>
+              <w:rPr>
+                <w:rFonts w:ascii="Arial Narrow" w:hAnsi="Arial Narrow" w:cstheme="minorHAnsi"/>
+                <w:bCs/>
+                <w:color w:val="000000" w:themeColor="text1"/>
+                <w:sz w:val="21"/>
+                <w:szCs w:val="21"/>
+                <w:shd w:val="clear" w:color="auto" w:fill="FFFFFF"/>
+                <w14:textOutline w14:w="0" w14:cap="flat" w14:cmpd="sng" w14:algn="ctr">
+                  <w14:noFill/>
+                  <w14:prstDash w14:val="solid"/>
+                  <w14:round/>
+                </w14:textOutline>
+              </w:rPr>
+              <w:t>†</w:t>
             </w:r>
           </w:p>
         </w:tc>
@@ -3371,6 +3410,28 @@
                 <w:sz w:val="20"/>
               </w:rPr>
               <w:t>(CID)</w:t>
+            </w:r>
+            <w:r>
+              <w:rPr>
+                <w:sz w:val="20"/>
+              </w:rPr>
+              <w:t xml:space="preserve"> </w:t>
+            </w:r>
+            <w:r>
+              <w:rPr>
+                <w:rFonts w:ascii="Arial Narrow" w:hAnsi="Arial Narrow" w:cstheme="minorHAnsi"/>
+                <w:bCs/>
+                <w:color w:val="000000" w:themeColor="text1"/>
+                <w:sz w:val="21"/>
+                <w:szCs w:val="21"/>
+                <w:shd w:val="clear" w:color="auto" w:fill="FFFFFF"/>
+                <w14:textOutline w14:w="0" w14:cap="flat" w14:cmpd="sng" w14:algn="ctr">
+                  <w14:noFill/>
+                  <w14:prstDash w14:val="solid"/>
+                  <w14:round/>
+                </w14:textOutline>
+              </w:rPr>
+              <w:t>†</w:t>
             </w:r>
           </w:p>
         </w:tc>
@@ -3416,7 +3477,23 @@
               <w:rPr>
                 <w:sz w:val="20"/>
               </w:rPr>
-              <w:t xml:space="preserve">  *</w:t>
+              <w:t xml:space="preserve"> </w:t>
+            </w:r>
+            <w:r>
+              <w:rPr>
+                <w:rFonts w:ascii="Arial Narrow" w:hAnsi="Arial Narrow" w:cstheme="minorHAnsi"/>
+                <w:bCs/>
+                <w:color w:val="000000" w:themeColor="text1"/>
+                <w:sz w:val="21"/>
+                <w:szCs w:val="21"/>
+                <w:shd w:val="clear" w:color="auto" w:fill="FFFFFF"/>
+                <w14:textOutline w14:w="0" w14:cap="flat" w14:cmpd="sng" w14:algn="ctr">
+                  <w14:noFill/>
+                  <w14:prstDash w14:val="solid"/>
+                  <w14:round/>
+                </w14:textOutline>
+              </w:rPr>
+              <w:t>†</w:t>
             </w:r>
           </w:p>
         </w:tc>
@@ -3504,6 +3581,28 @@
               </w:rPr>
               <w:t>Price Analysis</w:t>
             </w:r>
+            <w:r>
+              <w:rPr>
+                <w:sz w:val="20"/>
+              </w:rPr>
+              <w:t xml:space="preserve"> </w:t>
+            </w:r>
+            <w:r>
+              <w:rPr>
+                <w:rFonts w:ascii="Arial Narrow" w:hAnsi="Arial Narrow" w:cstheme="minorHAnsi"/>
+                <w:bCs/>
+                <w:color w:val="000000" w:themeColor="text1"/>
+                <w:sz w:val="21"/>
+                <w:szCs w:val="21"/>
+                <w:shd w:val="clear" w:color="auto" w:fill="FFFFFF"/>
+                <w14:textOutline w14:w="0" w14:cap="flat" w14:cmpd="sng" w14:algn="ctr">
+                  <w14:noFill/>
+                  <w14:prstDash w14:val="solid"/>
+                  <w14:round/>
+                </w14:textOutline>
+              </w:rPr>
+              <w:t>†</w:t>
+            </w:r>
           </w:p>
         </w:tc>
         <w:tc>
@@ -3546,7 +3645,23 @@
               <w:rPr>
                 <w:sz w:val="20"/>
               </w:rPr>
-              <w:t>*</w:t>
+              <w:t xml:space="preserve"> </w:t>
+            </w:r>
+            <w:r>
+              <w:rPr>
+                <w:rFonts w:ascii="Arial Narrow" w:hAnsi="Arial Narrow" w:cstheme="minorHAnsi"/>
+                <w:bCs/>
+                <w:color w:val="000000" w:themeColor="text1"/>
+                <w:sz w:val="21"/>
+                <w:szCs w:val="21"/>
+                <w:shd w:val="clear" w:color="auto" w:fill="FFFFFF"/>
+                <w14:textOutline w14:w="0" w14:cap="flat" w14:cmpd="sng" w14:algn="ctr">
+                  <w14:noFill/>
+                  <w14:prstDash w14:val="solid"/>
+                  <w14:round/>
+                </w14:textOutline>
+              </w:rPr>
+              <w:t>†</w:t>
             </w:r>
           </w:p>
         </w:tc>
@@ -3775,9 +3890,37 @@
             </w:pPr>
             <w:r>
               <w:rPr>
-                <w:sz w:val="20"/>
-              </w:rPr>
-              <w:t xml:space="preserve">*If planned date (subcontracts only):       </w:t>
+                <w:rFonts w:ascii="Arial Narrow" w:hAnsi="Arial Narrow" w:cstheme="minorHAnsi"/>
+                <w:bCs/>
+                <w:color w:val="000000" w:themeColor="text1"/>
+                <w:sz w:val="21"/>
+                <w:szCs w:val="21"/>
+                <w:shd w:val="clear" w:color="auto" w:fill="FFFFFF"/>
+                <w14:textOutline w14:w="0" w14:cap="flat" w14:cmpd="sng" w14:algn="ctr">
+                  <w14:noFill/>
+                  <w14:prstDash w14:val="solid"/>
+                  <w14:round/>
+                </w14:textOutline>
+              </w:rPr>
+              <w:t>†</w:t>
+            </w:r>
+            <w:r>
+              <w:rPr>
+                <w:rFonts w:ascii="Arial Narrow" w:hAnsi="Arial Narrow" w:cstheme="minorHAnsi"/>
+                <w:b/>
+                <w:bCs/>
+                <w:color w:val="172B4D"/>
+                <w:sz w:val="21"/>
+                <w:szCs w:val="21"/>
+                <w:shd w:val="clear" w:color="auto" w:fill="FFFFFF"/>
+              </w:rPr>
+              <w:t xml:space="preserve"> </w:t>
+            </w:r>
+            <w:r>
+              <w:rPr>
+                <w:sz w:val="20"/>
+              </w:rPr>
+              <w:t xml:space="preserve">If planned date (subcontracts only):       </w:t>
             </w:r>
           </w:p>
           <w:p>
@@ -8335,12 +8478,26 @@
     <w:sig w:usb0="E1002EFF" w:usb1="C000605B" w:usb2="00000029" w:usb3="00000000" w:csb0="000101FF" w:csb1="00000000"/>
   </w:font>
   <w:font w:name="MS Mincho">
-    <w:altName w:val="Yu Gothic"/>
+    <w:altName w:val="ＭＳ 明朝"/>
     <w:panose1 w:val="02020609040205080304"/>
     <w:charset w:val="80"/>
     <w:family w:val="modern"/>
     <w:pitch w:val="fixed"/>
     <w:sig w:usb0="E00002FF" w:usb1="6AC7FDFB" w:usb2="08000012" w:usb3="00000000" w:csb0="0002009F" w:csb1="00000000"/>
+  </w:font>
+  <w:font w:name="Arial Narrow">
+    <w:panose1 w:val="020B0606020202030204"/>
+    <w:charset w:val="00"/>
+    <w:family w:val="swiss"/>
+    <w:pitch w:val="variable"/>
+    <w:sig w:usb0="00000287" w:usb1="00000800" w:usb2="00000000" w:usb3="00000000" w:csb0="0000009F" w:csb1="00000000"/>
+  </w:font>
+  <w:font w:name="Calibri">
+    <w:panose1 w:val="020F0502020204030204"/>
+    <w:charset w:val="00"/>
+    <w:family w:val="swiss"/>
+    <w:pitch w:val="variable"/>
+    <w:sig w:usb0="E4002EFF" w:usb1="C200247B" w:usb2="00000009" w:usb3="00000000" w:csb0="000001FF" w:csb1="00000000"/>
   </w:font>
   <w:font w:name="Cambria">
     <w:panose1 w:val="02040503050406030204"/>
@@ -8348,13 +8505,6 @@
     <w:family w:val="roman"/>
     <w:pitch w:val="variable"/>
     <w:sig w:usb0="E00006FF" w:usb1="420024FF" w:usb2="02000000" w:usb3="00000000" w:csb0="0000019F" w:csb1="00000000"/>
-  </w:font>
-  <w:font w:name="Calibri">
-    <w:panose1 w:val="020F0502020204030204"/>
-    <w:charset w:val="00"/>
-    <w:family w:val="swiss"/>
-    <w:pitch w:val="variable"/>
-    <w:sig w:usb0="E4002EFF" w:usb1="C200247B" w:usb2="00000009" w:usb3="00000000" w:csb0="000001FF" w:csb1="00000000"/>
   </w:font>
   <w:font w:name="Calibri Light">
     <w:panose1 w:val="020F0302020204030204"/>
@@ -8402,6 +8552,7 @@
     <w:rsid w:val="003903D1"/>
     <w:rsid w:val="003D6D36"/>
     <w:rsid w:val="003E00EE"/>
+    <w:rsid w:val="00450186"/>
     <w:rsid w:val="004901E0"/>
     <w:rsid w:val="004D180E"/>
     <w:rsid w:val="0050799D"/>
@@ -8411,6 +8562,7 @@
     <w:rsid w:val="00557CFA"/>
     <w:rsid w:val="00582AEC"/>
     <w:rsid w:val="00592770"/>
+    <w:rsid w:val="005E4D49"/>
     <w:rsid w:val="00605A78"/>
     <w:rsid w:val="00671B35"/>
     <w:rsid w:val="0069327E"/>
@@ -9688,37 +9840,6 @@
 </file>
 
 <file path=customXml/item1.xml><?xml version="1.0" encoding="utf-8"?>
-<p:properties xmlns:p="http://schemas.microsoft.com/office/2006/metadata/properties" xmlns:xsi="http://www.w3.org/2001/XMLSchema-instance" xmlns:pc="http://schemas.microsoft.com/office/infopath/2007/PartnerControls">
-  <documentManagement>
-    <TaxKeywordTaxHTField xmlns="016c310d-f661-49a6-97ee-540076082437">
-      <Terms xmlns="http://schemas.microsoft.com/office/infopath/2007/PartnerControls">
-        <TermInfo xmlns="http://schemas.microsoft.com/office/infopath/2007/PartnerControls">
-          <TermName xmlns="http://schemas.microsoft.com/office/infopath/2007/PartnerControls">Unrestricted</TermName>
-          <TermId xmlns="http://schemas.microsoft.com/office/infopath/2007/PartnerControls">11111111-1111-1111-1111-111111111111</TermId>
-        </TermInfo>
-      </Terms>
-    </TaxKeywordTaxHTField>
-    <TaxCatchAll xmlns="016c310d-f661-49a6-97ee-540076082437"/>
-    <SIP_Label_Document xmlns="016c310d-f661-49a6-97ee-540076082437">;#0;#Unrestricted;#True;#;#;#;#</SIP_Label_Document>
-    <AverageRating xmlns="http://schemas.microsoft.com/sharepoint/v3" xsi:nil="true"/>
-  </documentManagement>
-</p:properties>
-</file>
-
-<file path=customXml/item2.xml><?xml version="1.0" encoding="utf-8"?>
-<b:Sources xmlns:b="http://schemas.openxmlformats.org/officeDocument/2006/bibliography" xmlns="http://schemas.openxmlformats.org/officeDocument/2006/bibliography" SelectedStyle="\APASixthEditionOfficeOnline.xsl" StyleName="APA" Version="6"/>
-</file>
-
-<file path=customXml/item3.xml><?xml version="1.0" encoding="utf-8"?>
-<?mso-contentType ?>
-<FormTemplates xmlns="http://schemas.microsoft.com/sharepoint/v3/contenttype/forms">
-  <Display>DocumentLibraryForm</Display>
-  <Edit>DocumentLibraryForm</Edit>
-  <New>DocumentLibraryForm</New>
-</FormTemplates>
-</file>
-
-<file path=customXml/item4.xml><?xml version="1.0" encoding="utf-8"?>
 <ct:contentTypeSchema xmlns:ct="http://schemas.microsoft.com/office/2006/metadata/contentType" xmlns:ma="http://schemas.microsoft.com/office/2006/metadata/properties/metaAttributes" ct:_="" ma:_="" ma:contentTypeName="Document" ma:contentTypeID="0x010100833E2717D64DEA4FBFABAC416D347394" ma:contentTypeVersion="6" ma:contentTypeDescription="Create a new document." ma:contentTypeScope="" ma:versionID="98a74335b8287497f43df26a30ee6108">
   <xsd:schema xmlns:xsd="http://www.w3.org/2001/XMLSchema" xmlns:xs="http://www.w3.org/2001/XMLSchema" xmlns:p="http://schemas.microsoft.com/office/2006/metadata/properties" xmlns:ns1="http://schemas.microsoft.com/sharepoint/v3" xmlns:ns2="016c310d-f661-49a6-97ee-540076082437" targetNamespace="http://schemas.microsoft.com/office/2006/metadata/properties" ma:root="true" ma:fieldsID="d32ef67c478e261fbf17576a93df92a4" ns1:_="" ns2:_="">
     <xsd:import namespace="http://schemas.microsoft.com/sharepoint/v3"/>
@@ -9881,34 +10002,38 @@
 </ct:contentTypeSchema>
 </file>
 
-<file path=customXml/itemProps1.xml><?xml version="1.0" encoding="utf-8"?>
-<ds:datastoreItem xmlns:ds="http://schemas.openxmlformats.org/officeDocument/2006/customXml" ds:itemID="{033400F4-1F04-4DBC-9784-C8B3AA89B53C}">
-  <ds:schemaRefs>
-    <ds:schemaRef ds:uri="http://schemas.microsoft.com/office/2006/metadata/properties"/>
-    <ds:schemaRef ds:uri="http://schemas.microsoft.com/office/infopath/2007/PartnerControls"/>
-    <ds:schemaRef ds:uri="016c310d-f661-49a6-97ee-540076082437"/>
-    <ds:schemaRef ds:uri="http://schemas.microsoft.com/sharepoint/v3"/>
-  </ds:schemaRefs>
-</ds:datastoreItem>
+<file path=customXml/item2.xml><?xml version="1.0" encoding="utf-8"?>
+<p:properties xmlns:p="http://schemas.microsoft.com/office/2006/metadata/properties" xmlns:xsi="http://www.w3.org/2001/XMLSchema-instance" xmlns:pc="http://schemas.microsoft.com/office/infopath/2007/PartnerControls">
+  <documentManagement>
+    <TaxKeywordTaxHTField xmlns="016c310d-f661-49a6-97ee-540076082437">
+      <Terms xmlns="http://schemas.microsoft.com/office/infopath/2007/PartnerControls">
+        <TermInfo xmlns="http://schemas.microsoft.com/office/infopath/2007/PartnerControls">
+          <TermName xmlns="http://schemas.microsoft.com/office/infopath/2007/PartnerControls">Unrestricted</TermName>
+          <TermId xmlns="http://schemas.microsoft.com/office/infopath/2007/PartnerControls">11111111-1111-1111-1111-111111111111</TermId>
+        </TermInfo>
+      </Terms>
+    </TaxKeywordTaxHTField>
+    <TaxCatchAll xmlns="016c310d-f661-49a6-97ee-540076082437"/>
+    <SIP_Label_Document xmlns="016c310d-f661-49a6-97ee-540076082437">;#0;#Unrestricted;#True;#;#;#;#</SIP_Label_Document>
+    <AverageRating xmlns="http://schemas.microsoft.com/sharepoint/v3" xsi:nil="true"/>
+  </documentManagement>
+</p:properties>
 </file>
 
-<file path=customXml/itemProps2.xml><?xml version="1.0" encoding="utf-8"?>
-<ds:datastoreItem xmlns:ds="http://schemas.openxmlformats.org/officeDocument/2006/customXml" ds:itemID="{CD6CF2A3-23DE-48BF-867B-89770F7DA3FE}">
-  <ds:schemaRefs>
-    <ds:schemaRef ds:uri="http://schemas.openxmlformats.org/officeDocument/2006/bibliography"/>
-  </ds:schemaRefs>
-</ds:datastoreItem>
+<file path=customXml/item3.xml><?xml version="1.0" encoding="utf-8"?>
+<b:Sources xmlns:b="http://schemas.openxmlformats.org/officeDocument/2006/bibliography" xmlns="http://schemas.openxmlformats.org/officeDocument/2006/bibliography" SelectedStyle="\APASixthEditionOfficeOnline.xsl" StyleName="APA" Version="6"/>
 </file>
 
-<file path=customXml/itemProps3.xml><?xml version="1.0" encoding="utf-8"?>
-<ds:datastoreItem xmlns:ds="http://schemas.openxmlformats.org/officeDocument/2006/customXml" ds:itemID="{6A21EC55-C1B2-4765-90AC-37A4F1604205}">
-  <ds:schemaRefs>
-    <ds:schemaRef ds:uri="http://schemas.microsoft.com/sharepoint/v3/contenttype/forms"/>
-  </ds:schemaRefs>
-</ds:datastoreItem>
+<file path=customXml/item4.xml><?xml version="1.0" encoding="utf-8"?>
+<?mso-contentType ?>
+<FormTemplates xmlns="http://schemas.microsoft.com/sharepoint/v3/contenttype/forms">
+  <Display>DocumentLibraryForm</Display>
+  <Edit>DocumentLibraryForm</Edit>
+  <New>DocumentLibraryForm</New>
+</FormTemplates>
 </file>
 
-<file path=customXml/itemProps4.xml><?xml version="1.0" encoding="utf-8"?>
+<file path=customXml/itemProps1.xml><?xml version="1.0" encoding="utf-8"?>
 <ds:datastoreItem xmlns:ds="http://schemas.openxmlformats.org/officeDocument/2006/customXml" ds:itemID="{70D90404-A780-484E-92B9-483A3C532657}">
   <ds:schemaRefs>
     <ds:schemaRef ds:uri="http://schemas.microsoft.com/office/2006/metadata/contentType"/>
@@ -9925,4 +10050,31 @@
     <ds:schemaRef ds:uri="http://schemas.microsoft.com/internal/obd"/>
   </ds:schemaRefs>
 </ds:datastoreItem>
+</file>
+
+<file path=customXml/itemProps2.xml><?xml version="1.0" encoding="utf-8"?>
+<ds:datastoreItem xmlns:ds="http://schemas.openxmlformats.org/officeDocument/2006/customXml" ds:itemID="{033400F4-1F04-4DBC-9784-C8B3AA89B53C}">
+  <ds:schemaRefs>
+    <ds:schemaRef ds:uri="http://schemas.microsoft.com/office/2006/metadata/properties"/>
+    <ds:schemaRef ds:uri="http://schemas.microsoft.com/office/infopath/2007/PartnerControls"/>
+    <ds:schemaRef ds:uri="016c310d-f661-49a6-97ee-540076082437"/>
+    <ds:schemaRef ds:uri="http://schemas.microsoft.com/sharepoint/v3"/>
+  </ds:schemaRefs>
+</ds:datastoreItem>
+</file>
+
+<file path=customXml/itemProps3.xml><?xml version="1.0" encoding="utf-8"?>
+<ds:datastoreItem xmlns:ds="http://schemas.openxmlformats.org/officeDocument/2006/customXml" ds:itemID="{CD6CF2A3-23DE-48BF-867B-89770F7DA3FE}">
+  <ds:schemaRefs>
+    <ds:schemaRef ds:uri="http://schemas.openxmlformats.org/officeDocument/2006/bibliography"/>
+  </ds:schemaRefs>
+</ds:datastoreItem>
+</file>
+
+<file path=customXml/itemProps4.xml><?xml version="1.0" encoding="utf-8"?>
+<ds:datastoreItem xmlns:ds="http://schemas.openxmlformats.org/officeDocument/2006/customXml" ds:itemID="{6A21EC55-C1B2-4765-90AC-37A4F1604205}">
+  <ds:schemaRefs>
+    <ds:schemaRef ds:uri="http://schemas.microsoft.com/sharepoint/v3/contenttype/forms"/>
+  </ds:schemaRefs>
+</ds:datastoreItem>
 </file>
</xml_diff>